<commit_message>
feat(editor): add AI assistant and dictation support
Implement initial scaffolding for voice dictation and AI-driven grammar
suggestions within the editor. This includes adding the Web Speech API
integration for dictation and a rule-based mock engine for grammar
checks via the WASM bridge.

- feat(editor): add `AssistantEngine` and `DictationEngine` modules
- feat(editor): implement rule-based grammar suggestion mock in `wasm_bridge.js`
- feat(editor): add UI components and animations for dictation state
- refactor(core): optimize conversion functions to use slices instead of
  consuming `Vec<Event>` to improve performance and flexibility
- refactor(wasm): update bridge to support `request_grammar_check` command
- docs: update backlog and checklist to reflect completed enterprise
  automation tasks
</commit_message>
<xml_diff>
--- a/crates/marksmen-roundtrip/tests/snapshots/demo_output.docx
+++ b/crates/marksmen-roundtrip/tests/snapshots/demo_output.docx
@@ -519,7 +519,9 @@
         <w:t xml:space="preserve">: </w:t>
       </w:r>
       <w:r>
-        <w:rPr/>
+        <w:rPr>
+          <w:color w:val="e11d48"/>
+        </w:rPr>
         <w:t xml:space="preserve">This text</w:t>
       </w:r>
       <w:r>
@@ -700,7 +702,7 @@
                     </pic:cNvPicPr>
                   </pic:nvPicPr>
                   <pic:blipFill>
-                    <a:blip r:embed="rIdImage16"/>
+                    <a:blip r:embed="rIdImage17"/>
                     <a:srcRect/>
                     <a:stretch>
                       <a:fillRect/>
@@ -841,7 +843,7 @@
                     </pic:cNvPicPr>
                   </pic:nvPicPr>
                   <pic:blipFill>
-                    <a:blip r:embed="rIdImage18"/>
+                    <a:blip r:embed="rIdImage19"/>
                     <a:srcRect/>
                     <a:stretch>
                       <a:fillRect/>

</xml_diff>